<commit_message>
Add manifest.json to track file metadata and hashes for project assets
</commit_message>
<xml_diff>
--- a/public/bahan/Konfirmasi-Piutang-Template.docx
+++ b/public/bahan/Konfirmasi-Piutang-Template.docx
@@ -165,13 +165,13 @@
         <w:jc w:val="both"/>
         <w:rPr>
           <w:rFonts w:ascii="Arial" w:hAnsi="Arial" w:cs="Arial"/>
-          <w:lang w:val="de-DE"/>
-        </w:rPr>
-      </w:pPr>
-      <w:r>
-        <w:rPr>
-          <w:rFonts w:ascii="Arial" w:hAnsi="Arial" w:cs="Arial"/>
-          <w:lang w:val="de-DE"/>
+          <w:lang w:val="id-ID"/>
+        </w:rPr>
+      </w:pPr>
+      <w:r>
+        <w:rPr>
+          <w:rFonts w:ascii="Arial" w:hAnsi="Arial" w:cs="Arial"/>
+          <w:lang w:val="id-ID"/>
         </w:rPr>
         <w:t>Dengan Hormat,</w:t>
       </w:r>
@@ -181,7 +181,7 @@
         <w:jc w:val="both"/>
         <w:rPr>
           <w:rFonts w:ascii="Arial" w:hAnsi="Arial" w:cs="Arial"/>
-          <w:lang w:val="de-DE"/>
+          <w:lang w:val="id-ID"/>
         </w:rPr>
       </w:pPr>
     </w:p>
@@ -190,13 +190,13 @@
         <w:jc w:val="both"/>
         <w:rPr>
           <w:rFonts w:ascii="Arial" w:hAnsi="Arial" w:cs="Arial"/>
-          <w:lang w:val="de-DE"/>
-        </w:rPr>
-      </w:pPr>
-      <w:r>
-        <w:rPr>
-          <w:rFonts w:ascii="Arial" w:hAnsi="Arial" w:cs="Arial"/>
-          <w:lang w:val="de-DE"/>
+          <w:lang w:val="id-ID"/>
+        </w:rPr>
+      </w:pPr>
+      <w:r>
+        <w:rPr>
+          <w:rFonts w:ascii="Arial" w:hAnsi="Arial" w:cs="Arial"/>
+          <w:lang w:val="id-ID"/>
         </w:rPr>
         <w:t xml:space="preserve">Sehubungan dengan audit </w:t>
       </w:r>
@@ -211,7 +211,7 @@
         <w:rPr>
           <w:rFonts w:ascii="Arial" w:hAnsi="Arial" w:cs="Arial"/>
           <w:b/>
-          <w:lang w:val="de-DE"/>
+          <w:lang w:val="id-ID"/>
         </w:rPr>
         <w:t>{{Nama_Klien}}</w:t>
       </w:r>
@@ -219,7 +219,7 @@
         <w:rPr>
           <w:rFonts w:ascii="Arial" w:hAnsi="Arial" w:cs="Arial"/>
           <w:b/>
-          <w:lang w:val="de-DE"/>
+          <w:lang w:val="id-ID"/>
         </w:rPr>
         <w:t xml:space="preserve"> </w:t>
       </w:r>
@@ -247,7 +247,7 @@
       <w:r>
         <w:rPr>
           <w:rFonts w:ascii="Arial" w:hAnsi="Arial" w:cs="Arial"/>
-          <w:lang w:val="de-DE"/>
+          <w:lang w:val="id-ID"/>
         </w:rPr>
         <w:t>A</w:t>
       </w:r>
@@ -261,7 +261,7 @@
       <w:r>
         <w:rPr>
           <w:rFonts w:ascii="Arial" w:hAnsi="Arial" w:cs="Arial"/>
-          <w:lang w:val="de-DE"/>
+          <w:lang w:val="id-ID"/>
         </w:rPr>
         <w:t xml:space="preserve">: </w:t>
       </w:r>
@@ -271,7 +271,7 @@
         <w:jc w:val="both"/>
         <w:rPr>
           <w:rFonts w:ascii="Arial" w:hAnsi="Arial" w:cs="Arial"/>
-          <w:lang w:val="de-DE"/>
+          <w:lang w:val="id-ID"/>
         </w:rPr>
       </w:pPr>
     </w:p>
@@ -297,15 +297,37 @@
         </w:rPr>
         <w:t xml:space="preserve">Kantor Akuntan Publik </w:t>
       </w:r>
+      <w:proofErr w:type="spellStart"/>
       <w:r>
         <w:rPr>
           <w:rFonts w:cs="Calibri"/>
           <w:b/>
           <w:color w:val="000000"/>
-          <w:lang w:val="de-DE"/>
-        </w:rPr>
-        <w:t>Kuncara Budi Santosa dan Rekan Cabang Samarinda</w:t>
-      </w:r>
+          <w:lang w:val="en-ID"/>
+        </w:rPr>
+        <w:t>Kuncara</w:t>
+      </w:r>
+      <w:proofErr w:type="spellEnd"/>
+      <w:r>
+        <w:rPr>
+          <w:rFonts w:cs="Calibri"/>
+          <w:b/>
+          <w:color w:val="000000"/>
+          <w:lang w:val="en-ID"/>
+        </w:rPr>
+        <w:t xml:space="preserve"> Budi Santosa dan Rekan Cabang </w:t>
+      </w:r>
+      <w:proofErr w:type="spellStart"/>
+      <w:r>
+        <w:rPr>
+          <w:rFonts w:cs="Calibri"/>
+          <w:b/>
+          <w:color w:val="000000"/>
+          <w:lang w:val="en-ID"/>
+        </w:rPr>
+        <w:t>Samarinda</w:t>
+      </w:r>
+      <w:proofErr w:type="spellEnd"/>
       <w:r>
         <w:rPr>
           <w:rFonts w:cs="Calibri"/>
@@ -695,27 +717,7 @@
           <w:color w:val="000000"/>
           <w:lang w:val="id-ID"/>
         </w:rPr>
-        <w:t>{{Sebutan</w:t>
-      </w:r>
-      <w:r>
-        <w:rPr>
-          <w:rFonts w:cs="Calibri"/>
-          <w:b/>
-          <w:bCs/>
-          <w:color w:val="000000"/>
-          <w:lang w:val="id-ID"/>
-        </w:rPr>
-        <w:t>2</w:t>
-      </w:r>
-      <w:r>
-        <w:rPr>
-          <w:rFonts w:cs="Calibri"/>
-          <w:b/>
-          <w:bCs/>
-          <w:color w:val="000000"/>
-          <w:lang w:val="id-ID"/>
-        </w:rPr>
-        <w:t>}}.</w:t>
+        <w:t>{{Sebutan2}}.</w:t>
       </w:r>
       <w:proofErr w:type="gramEnd"/>
       <w:r>
@@ -735,25 +737,7 @@
           <w:bCs/>
           <w:color w:val="000000" w:themeColor="text1"/>
         </w:rPr>
-        <w:t>{{Auditor</w:t>
-      </w:r>
-      <w:r>
-        <w:rPr>
-          <w:rFonts w:cstheme="minorHAnsi"/>
-          <w:b/>
-          <w:bCs/>
-          <w:color w:val="000000" w:themeColor="text1"/>
-        </w:rPr>
-        <w:t>2</w:t>
-      </w:r>
-      <w:r>
-        <w:rPr>
-          <w:rFonts w:cstheme="minorHAnsi"/>
-          <w:b/>
-          <w:bCs/>
-          <w:color w:val="000000" w:themeColor="text1"/>
-        </w:rPr>
-        <w:t>}}</w:t>
+        <w:t>{{Auditor2}}</w:t>
       </w:r>
     </w:p>
     <w:p>
@@ -1228,6 +1212,13 @@
         </w:rPr>
         <w:tab/>
         <w:t xml:space="preserve">:  </w:t>
+      </w:r>
+      <w:r>
+        <w:rPr>
+          <w:rFonts w:ascii="Arial" w:hAnsi="Arial" w:cs="Arial"/>
+          <w:lang w:val="id-ID"/>
+        </w:rPr>
+        <w:t>{{Nominal}}</w:t>
       </w:r>
     </w:p>
     <w:p>

</xml_diff>